<commit_message>
results and documentation, non important
</commit_message>
<xml_diff>
--- a/Comandos Trading Agents.docx
+++ b/Comandos Trading Agents.docx
@@ -65,55 +65,7 @@
         <w:rPr>
           <w:lang w:val="en-US"/>
         </w:rPr>
-        <w:t>“</w:t>
-      </w:r>
-      <w:r>
-        <w:rPr>
-          <w:lang w:val="en-US"/>
-        </w:rPr>
-        <w:t>C:\Users\</w:t>
-      </w:r>
-      <w:proofErr w:type="spellStart"/>
-      <w:r>
-        <w:rPr>
-          <w:lang w:val="en-US"/>
-        </w:rPr>
-        <w:t>alemu</w:t>
-      </w:r>
-      <w:proofErr w:type="spellEnd"/>
-      <w:r>
-        <w:rPr>
-          <w:lang w:val="en-US"/>
-        </w:rPr>
-        <w:t>\OneDrive\</w:t>
-      </w:r>
-      <w:proofErr w:type="spellStart"/>
-      <w:r>
-        <w:rPr>
-          <w:lang w:val="en-US"/>
-        </w:rPr>
-        <w:t>Documentos</w:t>
-      </w:r>
-      <w:proofErr w:type="spellEnd"/>
-      <w:r>
-        <w:rPr>
-          <w:lang w:val="en-US"/>
-        </w:rPr>
-        <w:t>\</w:t>
-      </w:r>
-      <w:proofErr w:type="spellStart"/>
-      <w:r>
-        <w:rPr>
-          <w:lang w:val="en-US"/>
-        </w:rPr>
-        <w:t>TradingAgents</w:t>
-      </w:r>
-      <w:proofErr w:type="spellEnd"/>
-      <w:r>
-        <w:rPr>
-          <w:lang w:val="en-US"/>
-        </w:rPr>
-        <w:t>”</w:t>
+        <w:t>"C:\Users\alemu\OneDrive\Documentos\TradingAgents"</w:t>
       </w:r>
     </w:p>
     <w:p>

</xml_diff>